<commit_message>
Switch to Option 1: ExpenseTracker planning and design (Python and C++)
The group was assigned the Expense Tracker, not the chat application, so this
replaces the Day 1 planning materials entirely.

Fixes the shared specification both implementations must satisfy: record shape
and validation, store operations, query semantics, the seeded dataset with its
expected totals, the demo sequence and an acceptance checklist. Records the
expected language differences before any code is written, including the index
invalidation risk in the C++ design.
</commit_message>
<xml_diff>
--- a/report/D1_Friday_Planning_and_Design.docx
+++ b/report/D1_Friday_Planning_and_Design.docx
@@ -13,7 +13,7 @@
         <w:rPr>
           <w:b/>
         </w:rPr>
-        <w:t>ConcurrentChat: Initial Planning and Design</w:t>
+        <w:t>ExpenseTracker: Initial Planning and Design</w:t>
       </w:r>
     </w:p>
     <w:p/>
@@ -22,7 +22,7 @@
         <w:jc w:val="center"/>
       </w:pPr>
       <w:r>
-        <w:t>Group Project Deliverable 1 (Friday) - Option 2: Simple Chat Application</w:t>
+        <w:t>Group Project Deliverable 1 (Friday) - Option 1: Expense Tracker Application</w:t>
       </w:r>
     </w:p>
     <w:p>
@@ -30,7 +30,7 @@
         <w:jc w:val="center"/>
       </w:pPr>
       <w:r>
-        <w:t>Languages: Rust and Go</w:t>
+        <w:t>Languages: Python and C++</w:t>
       </w:r>
     </w:p>
     <w:p>
@@ -96,7 +96,7 @@
           <w:b/>
         </w:rPr>
         <w:lastRenderedPageBreak/>
-        <w:t>ConcurrentChat: Initial Planning and Design</w:t>
+        <w:t>ExpenseTracker: Initial Planning and Design</w:t>
       </w:r>
     </w:p>
     <w:p>
@@ -115,7 +115,7 @@
         <w:ind w:firstLine="720"/>
       </w:pPr>
       <w:r>
-        <w:t>Our team is assigned Option 2, a simple chat application, implemented in Rust and Go. The application, which we call ConcurrentChat, is a text-based chat room in which several simulated users send messages concurrently to a central hub that owns the message history and answers queries against it. We will build it twice, once per language, with identical external behaviour.</w:t>
+        <w:t>Our team is assigned Option 1, an expense tracker, implemented in Python and C++. The application, which we call ExpenseTracker, records expenses with a date, an amount, a category and a description, filters them by category and by date range, searches their descriptions, and summarises spending by category and overall. We will build it twice, once per language, with identical external behaviour.</w:t>
       </w:r>
     </w:p>
     <w:p>
@@ -123,10 +123,10 @@
         <w:ind w:firstLine="720"/>
       </w:pPr>
       <w:r>
-        <w:t>The two languages are well matched to this application and to the purpose of the assignment. Both compile to native code and both were designed for concurrent systems, so neither has an unfair advantage on raw speed, and the comparison stays focused on design rather than on runtime overhead. At the same time they reach concurrency from opposite directions. Go is built on communicating sequential processes, in which independent processes exchange values over channels instead of sharing memory (Hoare, 1978; D</w:t>
+        <w:t xml:space="preserve">The pairing is well suited to the purpose of the assignment because the two languages disagree on almost every design question this application raises. Python decides types while the program runs and manages memory for the programmer; C++ fixes types at compile time and makes ownership an explicit part of the code (Sebesta, 2019). An expense tracker is small enough to finish in three days and still exercises records, containers, indexing, dates, aggregation and error handling, so the differences show up in </w:t>
       </w:r>
       <w:r>
-        <w:t>onovan &amp; Kernighan, 2015). Rust reaches a similar place through its type system, using ownership and borrowing to prove at compile time that data is not aliased across threads (Jung et al., 2021). A chat hub is a small enough problem to implement well in three days, and a demanding enough one that these differences become visible in ordinary code rather than in contrived examples.</w:t>
+        <w:t>ordinary code rather than in contrived examples.</w:t>
       </w:r>
     </w:p>
     <w:p>
@@ -154,21 +154,12 @@
     </w:p>
     <w:p>
       <w:pPr>
-        <w:ind w:firstLine="720"/>
-      </w:pPr>
-      <w:r>
-        <w:t>Table 1 maps the three required features onto the design. Each is satisfied identically in both languages so that behaviour never differs between implementations.</w:t>
-      </w:r>
-    </w:p>
-    <w:p>
-      <w:pPr>
         <w:keepNext/>
       </w:pPr>
       <w:r>
         <w:rPr>
           <w:b/>
         </w:rPr>
-        <w:lastRenderedPageBreak/>
         <w:t>Table 1</w:t>
       </w:r>
     </w:p>
@@ -190,8 +181,8 @@
         <w:tblLook w:val="04A0" w:firstRow="1" w:lastRow="0" w:firstColumn="1" w:lastColumn="0" w:noHBand="0" w:noVBand="1"/>
       </w:tblPr>
       <w:tblGrid>
-        <w:gridCol w:w="3312"/>
-        <w:gridCol w:w="5760"/>
+        <w:gridCol w:w="3456"/>
+        <w:gridCol w:w="5616"/>
       </w:tblGrid>
       <w:tr>
         <w:trPr>
@@ -200,7 +191,7 @@
         </w:trPr>
         <w:tc>
           <w:tcPr>
-            <w:tcW w:w="3312" w:type="dxa"/>
+            <w:tcW w:w="3456" w:type="dxa"/>
             <w:tcBorders>
               <w:top w:val="single" w:sz="8" w:space="0" w:color="000000"/>
               <w:bottom w:val="single" w:sz="8" w:space="0" w:color="000000"/>
@@ -220,7 +211,7 @@
         </w:tc>
         <w:tc>
           <w:tcPr>
-            <w:tcW w:w="5760" w:type="dxa"/>
+            <w:tcW w:w="5616" w:type="dxa"/>
             <w:tcBorders>
               <w:top w:val="single" w:sz="8" w:space="0" w:color="000000"/>
               <w:bottom w:val="single" w:sz="8" w:space="0" w:color="000000"/>
@@ -245,7 +236,7 @@
         </w:trPr>
         <w:tc>
           <w:tcPr>
-            <w:tcW w:w="3312" w:type="dxa"/>
+            <w:tcW w:w="3456" w:type="dxa"/>
           </w:tcPr>
           <w:p>
             <w:pPr>
@@ -255,13 +246,13 @@
               <w:rPr>
                 <w:sz w:val="20"/>
               </w:rPr>
-              <w:t>Simulate multiple users sending messages</w:t>
+              <w:t>Data storage for expenses with date, amount, category and description</w:t>
             </w:r>
           </w:p>
         </w:tc>
         <w:tc>
           <w:tcPr>
-            <w:tcW w:w="5760" w:type="dxa"/>
+            <w:tcW w:w="5616" w:type="dxa"/>
           </w:tcPr>
           <w:p>
             <w:pPr>
@@ -271,7 +262,7 @@
               <w:rPr>
                 <w:sz w:val="20"/>
               </w:rPr>
-              <w:t>One independent worker per user (async task in Rust, goroutine in Go) posting to a shared hub</w:t>
+              <w:t>A record carries id, date, amount, category and description; the store assigns the id and the validation rules are shared</w:t>
             </w:r>
           </w:p>
         </w:tc>
@@ -282,7 +273,7 @@
         </w:trPr>
         <w:tc>
           <w:tcPr>
-            <w:tcW w:w="3312" w:type="dxa"/>
+            <w:tcW w:w="3456" w:type="dxa"/>
           </w:tcPr>
           <w:p>
             <w:pPr>
@@ -292,13 +283,13 @@
               <w:rPr>
                 <w:sz w:val="20"/>
               </w:rPr>
-              <w:t>Store message history with timestamp and user ID</w:t>
+              <w:t>Filter and search by criteria such as date range and category</w:t>
             </w:r>
           </w:p>
         </w:tc>
         <w:tc>
           <w:tcPr>
-            <w:tcW w:w="5760" w:type="dxa"/>
+            <w:tcW w:w="5616" w:type="dxa"/>
           </w:tcPr>
           <w:p>
             <w:pPr>
@@ -308,7 +299,7 @@
               <w:rPr>
                 <w:sz w:val="20"/>
               </w:rPr>
-              <w:t>Each Message carries id, timestamp, user_id, username and a kind-specific payload; the hub assigns id and timestamp</w:t>
+              <w:t>by_category(name), in_range(from, to) and search(keyword); matching is case-insensitive and ranges are inclusive</w:t>
             </w:r>
           </w:p>
         </w:tc>
@@ -319,7 +310,7 @@
         </w:trPr>
         <w:tc>
           <w:tcPr>
-            <w:tcW w:w="3312" w:type="dxa"/>
+            <w:tcW w:w="3456" w:type="dxa"/>
             <w:tcBorders>
               <w:bottom w:val="single" w:sz="8" w:space="0" w:color="000000"/>
             </w:tcBorders>
@@ -332,13 +323,13 @@
               <w:rPr>
                 <w:sz w:val="20"/>
               </w:rPr>
-              <w:t>Filtering and search by user or keyword</w:t>
+              <w:t>Summary of totals by category and overall</w:t>
             </w:r>
           </w:p>
         </w:tc>
         <w:tc>
           <w:tcPr>
-            <w:tcW w:w="5760" w:type="dxa"/>
+            <w:tcW w:w="5616" w:type="dxa"/>
             <w:tcBorders>
               <w:bottom w:val="single" w:sz="8" w:space="0" w:color="000000"/>
             </w:tcBorders>
@@ -351,7 +342,7 @@
               <w:rPr>
                 <w:sz w:val="20"/>
               </w:rPr>
-              <w:t>Hub queries History(limit), ByUser(name) and Search(keyword), plus a Stats summary; all matching is case-insensitive</w:t>
+              <w:t>summary() returns per-category count, total and percentage share ordered by total, plus the overall total and record count</w:t>
             </w:r>
           </w:p>
         </w:tc>
@@ -371,6 +362,7 @@
           <w:b/>
           <w:i/>
         </w:rPr>
+        <w:lastRenderedPageBreak/>
         <w:t>Architecture</w:t>
       </w:r>
     </w:p>
@@ -379,7 +371,7 @@
         <w:ind w:firstLine="720"/>
       </w:pPr>
       <w:r>
-        <w:t>Both implementations follow a single-owner hub design. Every user worker holds only a sending handle; the message history itself is owned by one hub worker and is never shared. Commands travel to the hub over a channel, and any command expecting an answer carries the channel the answer returns on.</w:t>
+        <w:t>Both implementations use the same two layers, so that differences in the code are attributable to the languages rather than to differing designs. A driver provides the command-line modes and a store holds the records and answers every query. The store keeps a category index alongside the records so that filtering by category is a lookup rather than a scan.</w:t>
       </w:r>
     </w:p>
     <w:p>
@@ -407,7 +399,7 @@
           <w:rFonts w:ascii="Consolas" w:hAnsi="Consolas"/>
           <w:sz w:val="18"/>
         </w:rPr>
-        <w:t xml:space="preserve">  user worker  ─┐</w:t>
+        <w:t xml:space="preserve">  CLI driver  ──►  ExpenseStore  ──►  records container</w:t>
       </w:r>
     </w:p>
     <w:p>
@@ -422,7 +414,7 @@
           <w:rFonts w:ascii="Consolas" w:hAnsi="Consolas"/>
           <w:sz w:val="18"/>
         </w:rPr>
-        <w:t xml:space="preserve">  user worker  ─┼─►  [ command channel ]  ─►  HUB  ──► owns the history</w:t>
+        <w:t xml:space="preserve">  (demo / bench / REPL)      │              + category index</w:t>
       </w:r>
     </w:p>
     <w:p>
@@ -437,7 +429,7 @@
           <w:rFonts w:ascii="Consolas" w:hAnsi="Consolas"/>
           <w:sz w:val="18"/>
         </w:rPr>
-        <w:t xml:space="preserve">  user worker  ─┘                               │       (Vec&lt;Message&gt; / []Message)</w:t>
+        <w:t xml:space="preserve">                             └──►  queries: category, date range,</w:t>
       </w:r>
     </w:p>
     <w:p>
@@ -451,33 +443,13 @@
           <w:rFonts w:ascii="Consolas" w:hAnsi="Consolas"/>
           <w:sz w:val="18"/>
         </w:rPr>
-        <w:t xml:space="preserve">                                                └──►  reply channel  ─►  caller</w:t>
+        <w:t xml:space="preserve">                                    keyword, summary</w:t>
       </w:r>
     </w:p>
     <w:p>
       <w:pPr>
         <w:spacing w:after="120" w:line="240" w:lineRule="auto"/>
       </w:pPr>
-    </w:p>
-    <w:p>
-      <w:pPr>
-        <w:ind w:firstLine="720"/>
-      </w:pPr>
-      <w:r>
-        <w:t>The consequence of this design is that neither implementation needs a mutex. What we expect to differ, and what we intend to document, is how each language establishes that guarantee. In Rust the hub takes ownership of the history when the task is spawned, so the compiler can prove no other task reaches it. In Go the same property holds only because we follow the convention of not passing the slice elsewhere; the compiler does not check it.</w:t>
-      </w:r>
-    </w:p>
-    <w:p>
-      <w:pPr>
-        <w:keepNext/>
-      </w:pPr>
-      <w:r>
-        <w:rPr>
-          <w:b/>
-          <w:i/>
-        </w:rPr>
-        <w:t>Component Breakdown</w:t>
-      </w:r>
     </w:p>
     <w:p>
       <w:pPr>
@@ -508,10 +480,10 @@
         <w:tblLook w:val="04A0" w:firstRow="1" w:lastRow="0" w:firstColumn="1" w:lastColumn="0" w:noHBand="0" w:noVBand="1"/>
       </w:tblPr>
       <w:tblGrid>
-        <w:gridCol w:w="1728"/>
-        <w:gridCol w:w="3312"/>
-        <w:gridCol w:w="2016"/>
-        <w:gridCol w:w="2016"/>
+        <w:gridCol w:w="1440"/>
+        <w:gridCol w:w="3600"/>
+        <w:gridCol w:w="1872"/>
+        <w:gridCol w:w="2160"/>
       </w:tblGrid>
       <w:tr>
         <w:trPr>
@@ -520,7 +492,7 @@
         </w:trPr>
         <w:tc>
           <w:tcPr>
-            <w:tcW w:w="1728" w:type="dxa"/>
+            <w:tcW w:w="1440" w:type="dxa"/>
             <w:tcBorders>
               <w:top w:val="single" w:sz="8" w:space="0" w:color="000000"/>
               <w:bottom w:val="single" w:sz="8" w:space="0" w:color="000000"/>
@@ -540,7 +512,7 @@
         </w:tc>
         <w:tc>
           <w:tcPr>
-            <w:tcW w:w="3312" w:type="dxa"/>
+            <w:tcW w:w="3600" w:type="dxa"/>
             <w:tcBorders>
               <w:top w:val="single" w:sz="8" w:space="0" w:color="000000"/>
               <w:bottom w:val="single" w:sz="8" w:space="0" w:color="000000"/>
@@ -560,7 +532,7 @@
         </w:tc>
         <w:tc>
           <w:tcPr>
-            <w:tcW w:w="2016" w:type="dxa"/>
+            <w:tcW w:w="1872" w:type="dxa"/>
             <w:tcBorders>
               <w:top w:val="single" w:sz="8" w:space="0" w:color="000000"/>
               <w:bottom w:val="single" w:sz="8" w:space="0" w:color="000000"/>
@@ -574,13 +546,13 @@
               <w:rPr>
                 <w:sz w:val="20"/>
               </w:rPr>
-              <w:t>Rust</w:t>
+              <w:t>Python</w:t>
             </w:r>
           </w:p>
         </w:tc>
         <w:tc>
           <w:tcPr>
-            <w:tcW w:w="2016" w:type="dxa"/>
+            <w:tcW w:w="2160" w:type="dxa"/>
             <w:tcBorders>
               <w:top w:val="single" w:sz="8" w:space="0" w:color="000000"/>
               <w:bottom w:val="single" w:sz="8" w:space="0" w:color="000000"/>
@@ -594,7 +566,7 @@
               <w:rPr>
                 <w:sz w:val="20"/>
               </w:rPr>
-              <w:t>Go</w:t>
+              <w:t>C++</w:t>
             </w:r>
           </w:p>
         </w:tc>
@@ -605,7 +577,7 @@
         </w:trPr>
         <w:tc>
           <w:tcPr>
-            <w:tcW w:w="1728" w:type="dxa"/>
+            <w:tcW w:w="1440" w:type="dxa"/>
           </w:tcPr>
           <w:p>
             <w:pPr>
@@ -615,13 +587,13 @@
               <w:rPr>
                 <w:sz w:val="20"/>
               </w:rPr>
-              <w:t>Domain model</w:t>
+              <w:t>Record</w:t>
             </w:r>
           </w:p>
         </w:tc>
         <w:tc>
           <w:tcPr>
-            <w:tcW w:w="3312" w:type="dxa"/>
+            <w:tcW w:w="3600" w:type="dxa"/>
           </w:tcPr>
           <w:p>
             <w:pPr>
@@ -631,13 +603,13 @@
               <w:rPr>
                 <w:sz w:val="20"/>
               </w:rPr>
-              <w:t>Message representation, rendering, predicates</w:t>
+              <w:t>Build, validate and format one expense</w:t>
             </w:r>
           </w:p>
         </w:tc>
         <w:tc>
           <w:tcPr>
-            <w:tcW w:w="2016" w:type="dxa"/>
+            <w:tcW w:w="1872" w:type="dxa"/>
           </w:tcPr>
           <w:p>
             <w:pPr>
@@ -647,13 +619,13 @@
               <w:rPr>
                 <w:sz w:val="20"/>
               </w:rPr>
-              <w:t>src/model.rs</w:t>
+              <w:t>expense.py</w:t>
             </w:r>
           </w:p>
         </w:tc>
         <w:tc>
           <w:tcPr>
-            <w:tcW w:w="2016" w:type="dxa"/>
+            <w:tcW w:w="2160" w:type="dxa"/>
           </w:tcPr>
           <w:p>
             <w:pPr>
@@ -663,7 +635,7 @@
               <w:rPr>
                 <w:sz w:val="20"/>
               </w:rPr>
-              <w:t>internal/chat/model.go</w:t>
+              <w:t>expense.hpp</w:t>
             </w:r>
           </w:p>
         </w:tc>
@@ -674,7 +646,7 @@
         </w:trPr>
         <w:tc>
           <w:tcPr>
-            <w:tcW w:w="1728" w:type="dxa"/>
+            <w:tcW w:w="1440" w:type="dxa"/>
           </w:tcPr>
           <w:p>
             <w:pPr>
@@ -684,14 +656,13 @@
               <w:rPr>
                 <w:sz w:val="20"/>
               </w:rPr>
-              <w:lastRenderedPageBreak/>
-              <w:t>Hub</w:t>
+              <w:t>Store</w:t>
             </w:r>
           </w:p>
         </w:tc>
         <w:tc>
           <w:tcPr>
-            <w:tcW w:w="3312" w:type="dxa"/>
+            <w:tcW w:w="3600" w:type="dxa"/>
           </w:tcPr>
           <w:p>
             <w:pPr>
@@ -701,13 +672,13 @@
               <w:rPr>
                 <w:sz w:val="20"/>
               </w:rPr>
-              <w:t>Owns history; applies posts; answers queries</w:t>
+              <w:t>Hold records; run filters and the summary</w:t>
             </w:r>
           </w:p>
         </w:tc>
         <w:tc>
           <w:tcPr>
-            <w:tcW w:w="2016" w:type="dxa"/>
+            <w:tcW w:w="1872" w:type="dxa"/>
           </w:tcPr>
           <w:p>
             <w:pPr>
@@ -717,13 +688,13 @@
               <w:rPr>
                 <w:sz w:val="20"/>
               </w:rPr>
-              <w:t>src/hub.rs</w:t>
+              <w:t>store.py</w:t>
             </w:r>
           </w:p>
         </w:tc>
         <w:tc>
           <w:tcPr>
-            <w:tcW w:w="2016" w:type="dxa"/>
+            <w:tcW w:w="2160" w:type="dxa"/>
           </w:tcPr>
           <w:p>
             <w:pPr>
@@ -733,7 +704,7 @@
               <w:rPr>
                 <w:sz w:val="20"/>
               </w:rPr>
-              <w:t>internal/chat/hub.go</w:t>
+              <w:t>store.hpp / store.cpp</w:t>
             </w:r>
           </w:p>
         </w:tc>
@@ -744,7 +715,7 @@
         </w:trPr>
         <w:tc>
           <w:tcPr>
-            <w:tcW w:w="1728" w:type="dxa"/>
+            <w:tcW w:w="1440" w:type="dxa"/>
           </w:tcPr>
           <w:p>
             <w:pPr>
@@ -760,7 +731,7 @@
         </w:tc>
         <w:tc>
           <w:tcPr>
-            <w:tcW w:w="3312" w:type="dxa"/>
+            <w:tcW w:w="3600" w:type="dxa"/>
           </w:tcPr>
           <w:p>
             <w:pPr>
@@ -770,13 +741,13 @@
               <w:rPr>
                 <w:sz w:val="20"/>
               </w:rPr>
-              <w:t>CLI modes: demo, bench, REPL</w:t>
+              <w:t>CLI modes: demo, bench, interactive</w:t>
             </w:r>
           </w:p>
         </w:tc>
         <w:tc>
           <w:tcPr>
-            <w:tcW w:w="2016" w:type="dxa"/>
+            <w:tcW w:w="1872" w:type="dxa"/>
           </w:tcPr>
           <w:p>
             <w:pPr>
@@ -786,13 +757,13 @@
               <w:rPr>
                 <w:sz w:val="20"/>
               </w:rPr>
-              <w:t>src/main.rs</w:t>
+              <w:t>main.py</w:t>
             </w:r>
           </w:p>
         </w:tc>
         <w:tc>
           <w:tcPr>
-            <w:tcW w:w="2016" w:type="dxa"/>
+            <w:tcW w:w="2160" w:type="dxa"/>
           </w:tcPr>
           <w:p>
             <w:pPr>
@@ -802,7 +773,7 @@
               <w:rPr>
                 <w:sz w:val="20"/>
               </w:rPr>
-              <w:t>main.go</w:t>
+              <w:t>main.cpp</w:t>
             </w:r>
           </w:p>
         </w:tc>
@@ -813,7 +784,7 @@
         </w:trPr>
         <w:tc>
           <w:tcPr>
-            <w:tcW w:w="1728" w:type="dxa"/>
+            <w:tcW w:w="1440" w:type="dxa"/>
             <w:tcBorders>
               <w:bottom w:val="single" w:sz="8" w:space="0" w:color="000000"/>
             </w:tcBorders>
@@ -832,7 +803,7 @@
         </w:tc>
         <w:tc>
           <w:tcPr>
-            <w:tcW w:w="3312" w:type="dxa"/>
+            <w:tcW w:w="3600" w:type="dxa"/>
             <w:tcBorders>
               <w:bottom w:val="single" w:sz="8" w:space="0" w:color="000000"/>
             </w:tcBorders>
@@ -845,13 +816,13 @@
               <w:rPr>
                 <w:sz w:val="20"/>
               </w:rPr>
-              <w:t>Model predicates and hub behaviour</w:t>
+              <w:t>Record helpers and store queries</w:t>
             </w:r>
           </w:p>
         </w:tc>
         <w:tc>
           <w:tcPr>
-            <w:tcW w:w="2016" w:type="dxa"/>
+            <w:tcW w:w="1872" w:type="dxa"/>
             <w:tcBorders>
               <w:bottom w:val="single" w:sz="8" w:space="0" w:color="000000"/>
             </w:tcBorders>
@@ -864,13 +835,13 @@
               <w:rPr>
                 <w:sz w:val="20"/>
               </w:rPr>
-              <w:t>#[cfg(test)] in model.rs</w:t>
+              <w:t>test_expense.py</w:t>
             </w:r>
           </w:p>
         </w:tc>
         <w:tc>
           <w:tcPr>
-            <w:tcW w:w="2016" w:type="dxa"/>
+            <w:tcW w:w="2160" w:type="dxa"/>
             <w:tcBorders>
               <w:bottom w:val="single" w:sz="8" w:space="0" w:color="000000"/>
             </w:tcBorders>
@@ -883,7 +854,7 @@
               <w:rPr>
                 <w:sz w:val="20"/>
               </w:rPr>
-              <w:t>internal/chat/model_test.go</w:t>
+              <w:t>tests.cpp</w:t>
             </w:r>
           </w:p>
         </w:tc>
@@ -903,34 +874,6 @@
           <w:b/>
           <w:i/>
         </w:rPr>
-        <w:t>Message Model and Command Set</w:t>
-      </w:r>
-    </w:p>
-    <w:p>
-      <w:pPr>
-        <w:ind w:firstLine="720"/>
-      </w:pPr>
-      <w:r>
-        <w:t>A message is one of five kinds: a room message, a direct message to a named recipient, a join, a leave, or a system announcement. Only the first, second and fifth carry text, and only a direct message has a recipient. This is the single most interesting modelling decision in the project, because Rust can express it directly as an algebraic data type while Go has no equivalent construct and must approximate it.</w:t>
-      </w:r>
-    </w:p>
-    <w:p>
-      <w:pPr>
-        <w:ind w:firstLine="720"/>
-      </w:pPr>
-      <w:r>
-        <w:t>The hub accepts four commands: Post, Ask (carrying a query), Stats and Shutdown. Queries are History with a limit, ByUser with a name, and Search with a keyword. Commands must be processed in the order they are accepted, so that a query issued after a post observes that post.</w:t>
-      </w:r>
-    </w:p>
-    <w:p>
-      <w:pPr>
-        <w:keepNext/>
-      </w:pPr>
-      <w:r>
-        <w:rPr>
-          <w:b/>
-          <w:i/>
-        </w:rPr>
         <w:t>Command-Line Interface</w:t>
       </w:r>
     </w:p>
@@ -939,7 +882,7 @@
         <w:ind w:firstLine="720"/>
       </w:pPr>
       <w:r>
-        <w:t>Both implementations expose the same three modes, which keeps demonstration and measurement symmetrical. The demo mode runs a scripted concurrent session and then exercises filtering, search and the summary. The bench mode starts a configurable number of concurrent producers and reports throughput. With no arguments the program is an interactive prompt supporting /send, /dm, /history, /user, /search, /stats and /quit.</w:t>
+        <w:t>Both implementations expose the same three modes, which keeps demonstration and measurement symmetrical. The demo mode loads a seeded dataset of ten expenses and then runs every query in a fixed order, so the two outputs can be compared line by line. The bench mode inserts a configurable number of generated expenses and reports insert and query timings. With no arguments the program is an interactive prompt supporting /add, /list, /cat, /range, /search, /summary, /del and /quit.</w:t>
       </w:r>
     </w:p>
     <w:p>
@@ -958,7 +901,7 @@
         <w:ind w:firstLine="720"/>
       </w:pPr>
       <w:r>
-        <w:t>Table 3 records what we expect to find before writing the code. The Day 3 comparison report will revisit each row and state where we were right and where we were wrong, which is more useful than only reporting conclusions that happened to hold.</w:t>
+        <w:t>Table 3 records what we expect before writing the code. The Day 3 comparison report revisits each row and states where we were right and where we were wrong, which is more useful than reporting only the predictions that happened to hold.</w:t>
       </w:r>
     </w:p>
     <w:p>
@@ -991,8 +934,8 @@
         <w:tblLook w:val="04A0" w:firstRow="1" w:lastRow="0" w:firstColumn="1" w:lastColumn="0" w:noHBand="0" w:noVBand="1"/>
       </w:tblPr>
       <w:tblGrid>
-        <w:gridCol w:w="1872"/>
-        <w:gridCol w:w="7200"/>
+        <w:gridCol w:w="1728"/>
+        <w:gridCol w:w="7344"/>
       </w:tblGrid>
       <w:tr>
         <w:trPr>
@@ -1001,7 +944,7 @@
         </w:trPr>
         <w:tc>
           <w:tcPr>
-            <w:tcW w:w="1872" w:type="dxa"/>
+            <w:tcW w:w="1728" w:type="dxa"/>
             <w:tcBorders>
               <w:top w:val="single" w:sz="8" w:space="0" w:color="000000"/>
               <w:bottom w:val="single" w:sz="8" w:space="0" w:color="000000"/>
@@ -1021,7 +964,7 @@
         </w:tc>
         <w:tc>
           <w:tcPr>
-            <w:tcW w:w="7200" w:type="dxa"/>
+            <w:tcW w:w="7344" w:type="dxa"/>
             <w:tcBorders>
               <w:top w:val="single" w:sz="8" w:space="0" w:color="000000"/>
               <w:bottom w:val="single" w:sz="8" w:space="0" w:color="000000"/>
@@ -1046,7 +989,7 @@
         </w:trPr>
         <w:tc>
           <w:tcPr>
-            <w:tcW w:w="1872" w:type="dxa"/>
+            <w:tcW w:w="1728" w:type="dxa"/>
           </w:tcPr>
           <w:p>
             <w:pPr>
@@ -1056,13 +999,13 @@
               <w:rPr>
                 <w:sz w:val="20"/>
               </w:rPr>
-              <w:t>Sum types</w:t>
+              <w:t>Type systems</w:t>
             </w:r>
           </w:p>
         </w:tc>
         <w:tc>
           <w:tcPr>
-            <w:tcW w:w="7200" w:type="dxa"/>
+            <w:tcW w:w="7344" w:type="dxa"/>
           </w:tcPr>
           <w:p>
             <w:pPr>
@@ -1072,7 +1015,7 @@
               <w:rPr>
                 <w:sz w:val="20"/>
               </w:rPr>
-              <w:t>Rust enums carry a payload per variant and match is exhaustive; Go must approximate this with a tag plus unused fields or an interface plus a type switch, neither checked for exhaustiveness</w:t>
+              <w:t>Python will accept an amount given as an int, a float or a string and fail only when the bad value is used; C++ fixes the parameter type, so the same mistake cannot be written at all</w:t>
             </w:r>
           </w:p>
         </w:tc>
@@ -1083,7 +1026,7 @@
         </w:trPr>
         <w:tc>
           <w:tcPr>
-            <w:tcW w:w="1872" w:type="dxa"/>
+            <w:tcW w:w="1728" w:type="dxa"/>
           </w:tcPr>
           <w:p>
             <w:pPr>
@@ -1093,13 +1036,13 @@
               <w:rPr>
                 <w:sz w:val="20"/>
               </w:rPr>
-              <w:t>Concurrency</w:t>
+              <w:t>Data structures</w:t>
             </w:r>
           </w:p>
         </w:tc>
         <w:tc>
           <w:tcPr>
-            <w:tcW w:w="7200" w:type="dxa"/>
+            <w:tcW w:w="7344" w:type="dxa"/>
           </w:tcPr>
           <w:p>
             <w:pPr>
@@ -1109,7 +1052,7 @@
               <w:rPr>
                 <w:sz w:val="20"/>
               </w:rPr>
-              <w:t>Go goroutines read as ordinary synchronous code; Rust async requires explicit await and a runtime, so we expect Go to be easier to write and Rust to encode more in its types</w:t>
+              <w:t>Python dict and C++ std::unordered_map are both hash tables, so the algorithmic shape should match and only the constant factors should differ</w:t>
             </w:r>
           </w:p>
         </w:tc>
@@ -1120,7 +1063,81 @@
         </w:trPr>
         <w:tc>
           <w:tcPr>
-            <w:tcW w:w="1872" w:type="dxa"/>
+            <w:tcW w:w="1728" w:type="dxa"/>
+          </w:tcPr>
+          <w:p>
+            <w:pPr>
+              <w:spacing w:before="40" w:after="20" w:line="240" w:lineRule="auto"/>
+            </w:pPr>
+            <w:r>
+              <w:rPr>
+                <w:sz w:val="20"/>
+              </w:rPr>
+              <w:t>Memory management</w:t>
+            </w:r>
+          </w:p>
+        </w:tc>
+        <w:tc>
+          <w:tcPr>
+            <w:tcW w:w="7344" w:type="dxa"/>
+          </w:tcPr>
+          <w:p>
+            <w:pPr>
+              <w:spacing w:before="40" w:after="20" w:line="240" w:lineRule="auto"/>
+            </w:pPr>
+            <w:r>
+              <w:rPr>
+                <w:sz w:val="20"/>
+              </w:rPr>
+              <w:t>Python reference-counts and collects cycles; C++ containers own their buffers and free them in destructors, so we expect no new or delete anywhere and a smaller footprint</w:t>
+            </w:r>
+          </w:p>
+        </w:tc>
+      </w:tr>
+      <w:tr>
+        <w:trPr>
+          <w:cantSplit/>
+        </w:trPr>
+        <w:tc>
+          <w:tcPr>
+            <w:tcW w:w="1728" w:type="dxa"/>
+          </w:tcPr>
+          <w:p>
+            <w:pPr>
+              <w:spacing w:before="40" w:after="20" w:line="240" w:lineRule="auto"/>
+            </w:pPr>
+            <w:r>
+              <w:rPr>
+                <w:sz w:val="20"/>
+              </w:rPr>
+              <w:t>Dates</w:t>
+            </w:r>
+          </w:p>
+        </w:tc>
+        <w:tc>
+          <w:tcPr>
+            <w:tcW w:w="7344" w:type="dxa"/>
+          </w:tcPr>
+          <w:p>
+            <w:pPr>
+              <w:spacing w:before="40" w:after="20" w:line="240" w:lineRule="auto"/>
+            </w:pPr>
+            <w:r>
+              <w:rPr>
+                <w:sz w:val="20"/>
+              </w:rPr>
+              <w:t>Python’s datetime parses, validates and compares out of the box; C++20 chrono supplies a calendar type but we expect to write parsing and formatting ourselves</w:t>
+            </w:r>
+          </w:p>
+        </w:tc>
+      </w:tr>
+      <w:tr>
+        <w:trPr>
+          <w:cantSplit/>
+        </w:trPr>
+        <w:tc>
+          <w:tcPr>
+            <w:tcW w:w="1728" w:type="dxa"/>
           </w:tcPr>
           <w:p>
             <w:pPr>
@@ -1136,7 +1153,7 @@
         </w:tc>
         <w:tc>
           <w:tcPr>
-            <w:tcW w:w="7200" w:type="dxa"/>
+            <w:tcW w:w="7344" w:type="dxa"/>
           </w:tcPr>
           <w:p>
             <w:pPr>
@@ -1146,7 +1163,7 @@
               <w:rPr>
                 <w:sz w:val="20"/>
               </w:rPr>
-              <w:t>Rust Result must be consumed or the compiler warns; a Go error can be discarded with a single underscore</w:t>
+              <w:t>Both use exceptions, but Python will surface type problems at run time where C++ surfaces most of them at compile time</w:t>
             </w:r>
           </w:p>
         </w:tc>
@@ -1157,81 +1174,7 @@
         </w:trPr>
         <w:tc>
           <w:tcPr>
-            <w:tcW w:w="1872" w:type="dxa"/>
-          </w:tcPr>
-          <w:p>
-            <w:pPr>
-              <w:spacing w:before="40" w:after="20" w:line="240" w:lineRule="auto"/>
-            </w:pPr>
-            <w:r>
-              <w:rPr>
-                <w:sz w:val="20"/>
-              </w:rPr>
-              <w:t>Memory</w:t>
-            </w:r>
-          </w:p>
-        </w:tc>
-        <w:tc>
-          <w:tcPr>
-            <w:tcW w:w="7200" w:type="dxa"/>
-          </w:tcPr>
-          <w:p>
-            <w:pPr>
-              <w:spacing w:before="40" w:after="20" w:line="240" w:lineRule="auto"/>
-            </w:pPr>
-            <w:r>
-              <w:rPr>
-                <w:sz w:val="20"/>
-              </w:rPr>
-              <w:t>Neither requires manual freeing; Rust frees at scope exit, Go uses a garbage collector, which we expect to cost memory under load</w:t>
-            </w:r>
-          </w:p>
-        </w:tc>
-      </w:tr>
-      <w:tr>
-        <w:trPr>
-          <w:cantSplit/>
-        </w:trPr>
-        <w:tc>
-          <w:tcPr>
-            <w:tcW w:w="1872" w:type="dxa"/>
-          </w:tcPr>
-          <w:p>
-            <w:pPr>
-              <w:spacing w:before="40" w:after="20" w:line="240" w:lineRule="auto"/>
-            </w:pPr>
-            <w:r>
-              <w:rPr>
-                <w:sz w:val="20"/>
-              </w:rPr>
-              <w:t>Modularity</w:t>
-            </w:r>
-          </w:p>
-        </w:tc>
-        <w:tc>
-          <w:tcPr>
-            <w:tcW w:w="7200" w:type="dxa"/>
-          </w:tcPr>
-          <w:p>
-            <w:pPr>
-              <w:spacing w:before="40" w:after="20" w:line="240" w:lineRule="auto"/>
-            </w:pPr>
-            <w:r>
-              <w:rPr>
-                <w:sz w:val="20"/>
-              </w:rPr>
-              <w:t>Rust modules with explicit pub versus Go packages with capitalisation-based export</w:t>
-            </w:r>
-          </w:p>
-        </w:tc>
-      </w:tr>
-      <w:tr>
-        <w:trPr>
-          <w:cantSplit/>
-        </w:trPr>
-        <w:tc>
-          <w:tcPr>
-            <w:tcW w:w="1872" w:type="dxa"/>
+            <w:tcW w:w="1728" w:type="dxa"/>
             <w:tcBorders>
               <w:bottom w:val="single" w:sz="8" w:space="0" w:color="000000"/>
             </w:tcBorders>
@@ -1250,7 +1193,7 @@
         </w:tc>
         <w:tc>
           <w:tcPr>
-            <w:tcW w:w="7200" w:type="dxa"/>
+            <w:tcW w:w="7344" w:type="dxa"/>
             <w:tcBorders>
               <w:bottom w:val="single" w:sz="8" w:space="0" w:color="000000"/>
             </w:tcBorders>
@@ -1263,7 +1206,7 @@
               <w:rPr>
                 <w:sz w:val="20"/>
               </w:rPr>
-              <w:t>Within the same order of magnitude, with Rust ahead because it has no collector and no interface dispatch in the hot path</w:t>
+              <w:t>C++ faster on insert and on queries, probably by a single-digit multiple rather than orders of magnitude, because both use hash-indexed containers</w:t>
             </w:r>
           </w:p>
         </w:tc>
@@ -1292,7 +1235,7 @@
         <w:ind w:left="1080"/>
       </w:pPr>
       <w:r>
-        <w:t>Ordering. If commands travel on separate channels, Go’s select chooses at random among ready cases, so a query could be served before queued posts are applied. Mitigation: a single ordered command channel in both implementations.</w:t>
+        <w:t>Index invalidation. If the C++ store indexes records by their position in a vector, deleting a record shifts every later element and invalidates the index. Mitigation: rebuild the index on delete and document the cost against Python’s id-keyed approach, which does not have the problem.</w:t>
       </w:r>
     </w:p>
     <w:p>
@@ -1301,7 +1244,7 @@
         <w:ind w:left="1080"/>
       </w:pPr>
       <w:r>
-        <w:t>Demo determinism. Concurrent interleaving differs between runs, so tests must assert on counts and filter results rather than on exact message order.</w:t>
+        <w:t>Floating-point money. Binary floating point cannot represent every decimal amount exactly. Mitigation: both implementations use a double and format to two decimals, so they agree with each other; the limitation is recorded rather than hidden.</w:t>
       </w:r>
     </w:p>
     <w:p>
@@ -1310,7 +1253,7 @@
         <w:ind w:left="1080"/>
       </w:pPr>
       <w:r>
-        <w:t>Toolchain parity. Timings are only comparable if both run on the same machine. Mitigation: one WSL2 Ubuntu 24.04 environment with rustc 1.95.0 and Go 1.27.1 for all builds and measurements.</w:t>
+        <w:t>Toolchain parity. Timings are comparable only if both run on one machine. Mitigation: a single WSL2 Ubuntu 24.04 environment with Python 3.12.3 and g++ 13.3.0 for every build and measurement.</w:t>
       </w:r>
     </w:p>
     <w:p>
@@ -1329,7 +1272,11 @@
         <w:ind w:firstLine="720"/>
       </w:pPr>
       <w:r>
-        <w:t>Roles are assigned so that each member owns one language or the cross-cutting analysis, and so that no member is blocked waiting on another. All three members participate in the presentation.</w:t>
+        <w:t xml:space="preserve">Roles are assigned so that each member owns one language or the cross-cutting analysis, and so that no member is blocked waiting on another. The shared specification is agreed first by </w:t>
+      </w:r>
+      <w:r>
+        <w:lastRenderedPageBreak/>
+        <w:t>all three, which is what makes the two implementations comparable rather than merely similar. All three members present on Sunday.</w:t>
       </w:r>
     </w:p>
     <w:p>
@@ -1340,7 +1287,6 @@
         <w:rPr>
           <w:b/>
         </w:rPr>
-        <w:lastRenderedPageBreak/>
         <w:t>Table 4</w:t>
       </w:r>
     </w:p>
@@ -1362,9 +1308,9 @@
         <w:tblLook w:val="04A0" w:firstRow="1" w:lastRow="0" w:firstColumn="1" w:lastColumn="0" w:noHBand="0" w:noVBand="1"/>
       </w:tblPr>
       <w:tblGrid>
-        <w:gridCol w:w="1872"/>
+        <w:gridCol w:w="1728"/>
         <w:gridCol w:w="3888"/>
-        <w:gridCol w:w="3312"/>
+        <w:gridCol w:w="3456"/>
       </w:tblGrid>
       <w:tr>
         <w:trPr>
@@ -1373,7 +1319,7 @@
         </w:trPr>
         <w:tc>
           <w:tcPr>
-            <w:tcW w:w="1872" w:type="dxa"/>
+            <w:tcW w:w="1728" w:type="dxa"/>
             <w:tcBorders>
               <w:top w:val="single" w:sz="8" w:space="0" w:color="000000"/>
               <w:bottom w:val="single" w:sz="8" w:space="0" w:color="000000"/>
@@ -1413,7 +1359,7 @@
         </w:tc>
         <w:tc>
           <w:tcPr>
-            <w:tcW w:w="3312" w:type="dxa"/>
+            <w:tcW w:w="3456" w:type="dxa"/>
             <w:tcBorders>
               <w:top w:val="single" w:sz="8" w:space="0" w:color="000000"/>
               <w:bottom w:val="single" w:sz="8" w:space="0" w:color="000000"/>
@@ -1438,7 +1384,7 @@
         </w:trPr>
         <w:tc>
           <w:tcPr>
-            <w:tcW w:w="1872" w:type="dxa"/>
+            <w:tcW w:w="1728" w:type="dxa"/>
           </w:tcPr>
           <w:p>
             <w:pPr>
@@ -1464,13 +1410,13 @@
               <w:rPr>
                 <w:sz w:val="20"/>
               </w:rPr>
-              <w:t>Rust implementation: model, hub, async tasks, CLI</w:t>
+              <w:t>Python implementation: record, store, queries, CLI</w:t>
             </w:r>
           </w:p>
         </w:tc>
         <w:tc>
           <w:tcPr>
-            <w:tcW w:w="3312" w:type="dxa"/>
+            <w:tcW w:w="3456" w:type="dxa"/>
           </w:tcPr>
           <w:p>
             <w:pPr>
@@ -1491,7 +1437,7 @@
         </w:trPr>
         <w:tc>
           <w:tcPr>
-            <w:tcW w:w="1872" w:type="dxa"/>
+            <w:tcW w:w="1728" w:type="dxa"/>
           </w:tcPr>
           <w:p>
             <w:pPr>
@@ -1517,13 +1463,13 @@
               <w:rPr>
                 <w:sz w:val="20"/>
               </w:rPr>
-              <w:t>Go implementation: model, hub, goroutines, CLI</w:t>
+              <w:t>C++ implementation: struct, STL containers, CLI</w:t>
             </w:r>
           </w:p>
         </w:tc>
         <w:tc>
           <w:tcPr>
-            <w:tcW w:w="3312" w:type="dxa"/>
+            <w:tcW w:w="3456" w:type="dxa"/>
           </w:tcPr>
           <w:p>
             <w:pPr>
@@ -1533,7 +1479,7 @@
               <w:rPr>
                 <w:sz w:val="20"/>
               </w:rPr>
-              <w:t>Unit tests, go vet and race-detector runs</w:t>
+              <w:t>Unit tests; AddressSanitizer and warning-clean builds</w:t>
             </w:r>
           </w:p>
         </w:tc>
@@ -1544,7 +1490,7 @@
         </w:trPr>
         <w:tc>
           <w:tcPr>
-            <w:tcW w:w="1872" w:type="dxa"/>
+            <w:tcW w:w="1728" w:type="dxa"/>
             <w:tcBorders>
               <w:bottom w:val="single" w:sz="8" w:space="0" w:color="000000"/>
             </w:tcBorders>
@@ -1582,7 +1528,7 @@
         </w:tc>
         <w:tc>
           <w:tcPr>
-            <w:tcW w:w="3312" w:type="dxa"/>
+            <w:tcW w:w="3456" w:type="dxa"/>
             <w:tcBorders>
               <w:bottom w:val="single" w:sz="8" w:space="0" w:color="000000"/>
             </w:tcBorders>
@@ -1603,21 +1549,8 @@
     </w:tbl>
     <w:p>
       <w:pPr>
-        <w:spacing w:before="80" w:after="120" w:line="240" w:lineRule="auto"/>
+        <w:spacing w:line="240" w:lineRule="auto"/>
       </w:pPr>
-      <w:r>
-        <w:rPr>
-          <w:i/>
-          <w:sz w:val="20"/>
-        </w:rPr>
-        <w:t xml:space="preserve">Note. </w:t>
-      </w:r>
-      <w:r>
-        <w:rPr>
-          <w:sz w:val="20"/>
-        </w:rPr>
-        <w:t>The shared specification is written first and agreed by all three members, so that the two implementations are comparable rather than merely similar.</w:t>
-      </w:r>
     </w:p>
     <w:p>
       <w:pPr>
@@ -1659,8 +1592,8 @@
         <w:tblLook w:val="04A0" w:firstRow="1" w:lastRow="0" w:firstColumn="1" w:lastColumn="0" w:noHBand="0" w:noVBand="1"/>
       </w:tblPr>
       <w:tblGrid>
-        <w:gridCol w:w="1296"/>
-        <w:gridCol w:w="5472"/>
+        <w:gridCol w:w="1152"/>
+        <w:gridCol w:w="5616"/>
         <w:gridCol w:w="2304"/>
       </w:tblGrid>
       <w:tr>
@@ -1670,7 +1603,7 @@
         </w:trPr>
         <w:tc>
           <w:tcPr>
-            <w:tcW w:w="1296" w:type="dxa"/>
+            <w:tcW w:w="1152" w:type="dxa"/>
             <w:tcBorders>
               <w:top w:val="single" w:sz="8" w:space="0" w:color="000000"/>
               <w:bottom w:val="single" w:sz="8" w:space="0" w:color="000000"/>
@@ -1690,7 +1623,7 @@
         </w:tc>
         <w:tc>
           <w:tcPr>
-            <w:tcW w:w="5472" w:type="dxa"/>
+            <w:tcW w:w="5616" w:type="dxa"/>
             <w:tcBorders>
               <w:top w:val="single" w:sz="8" w:space="0" w:color="000000"/>
               <w:bottom w:val="single" w:sz="8" w:space="0" w:color="000000"/>
@@ -1735,7 +1668,7 @@
         </w:trPr>
         <w:tc>
           <w:tcPr>
-            <w:tcW w:w="1296" w:type="dxa"/>
+            <w:tcW w:w="1152" w:type="dxa"/>
           </w:tcPr>
           <w:p>
             <w:pPr>
@@ -1751,7 +1684,7 @@
         </w:tc>
         <w:tc>
           <w:tcPr>
-            <w:tcW w:w="5472" w:type="dxa"/>
+            <w:tcW w:w="5616" w:type="dxa"/>
           </w:tcPr>
           <w:p>
             <w:pPr>
@@ -1761,7 +1694,7 @@
               <w:rPr>
                 <w:sz w:val="20"/>
               </w:rPr>
-              <w:t>Shared specification, architecture, command set agreed</w:t>
+              <w:t>Shared specification, architecture and query semantics agreed</w:t>
             </w:r>
           </w:p>
         </w:tc>
@@ -1788,7 +1721,7 @@
         </w:trPr>
         <w:tc>
           <w:tcPr>
-            <w:tcW w:w="1296" w:type="dxa"/>
+            <w:tcW w:w="1152" w:type="dxa"/>
           </w:tcPr>
           <w:p>
             <w:pPr>
@@ -1804,7 +1737,7 @@
         </w:tc>
         <w:tc>
           <w:tcPr>
-            <w:tcW w:w="5472" w:type="dxa"/>
+            <w:tcW w:w="5616" w:type="dxa"/>
           </w:tcPr>
           <w:p>
             <w:pPr>
@@ -1841,7 +1774,7 @@
         </w:trPr>
         <w:tc>
           <w:tcPr>
-            <w:tcW w:w="1296" w:type="dxa"/>
+            <w:tcW w:w="1152" w:type="dxa"/>
           </w:tcPr>
           <w:p>
             <w:pPr>
@@ -1857,7 +1790,7 @@
         </w:tc>
         <w:tc>
           <w:tcPr>
-            <w:tcW w:w="5472" w:type="dxa"/>
+            <w:tcW w:w="5616" w:type="dxa"/>
           </w:tcPr>
           <w:p>
             <w:pPr>
@@ -1867,7 +1800,7 @@
               <w:rPr>
                 <w:sz w:val="20"/>
               </w:rPr>
-              <w:t>Domain model and hub compiling in both languages</w:t>
+              <w:t>Record and store types compiling in both languages</w:t>
             </w:r>
           </w:p>
         </w:tc>
@@ -1894,7 +1827,7 @@
         </w:trPr>
         <w:tc>
           <w:tcPr>
-            <w:tcW w:w="1296" w:type="dxa"/>
+            <w:tcW w:w="1152" w:type="dxa"/>
           </w:tcPr>
           <w:p>
             <w:pPr>
@@ -1910,7 +1843,7 @@
         </w:tc>
         <w:tc>
           <w:tcPr>
-            <w:tcW w:w="5472" w:type="dxa"/>
+            <w:tcW w:w="5616" w:type="dxa"/>
           </w:tcPr>
           <w:p>
             <w:pPr>
@@ -1920,7 +1853,7 @@
               <w:rPr>
                 <w:sz w:val="20"/>
               </w:rPr>
-              <w:t>Concurrent demo working end to end in both</w:t>
+              <w:t>Seeded dataset, listing and category filter working</w:t>
             </w:r>
           </w:p>
         </w:tc>
@@ -1947,7 +1880,7 @@
         </w:trPr>
         <w:tc>
           <w:tcPr>
-            <w:tcW w:w="1296" w:type="dxa"/>
+            <w:tcW w:w="1152" w:type="dxa"/>
           </w:tcPr>
           <w:p>
             <w:pPr>
@@ -1963,7 +1896,7 @@
         </w:tc>
         <w:tc>
           <w:tcPr>
-            <w:tcW w:w="5472" w:type="dxa"/>
+            <w:tcW w:w="5616" w:type="dxa"/>
           </w:tcPr>
           <w:p>
             <w:pPr>
@@ -2000,7 +1933,7 @@
         </w:trPr>
         <w:tc>
           <w:tcPr>
-            <w:tcW w:w="1296" w:type="dxa"/>
+            <w:tcW w:w="1152" w:type="dxa"/>
           </w:tcPr>
           <w:p>
             <w:pPr>
@@ -2016,7 +1949,7 @@
         </w:tc>
         <w:tc>
           <w:tcPr>
-            <w:tcW w:w="5472" w:type="dxa"/>
+            <w:tcW w:w="5616" w:type="dxa"/>
           </w:tcPr>
           <w:p>
             <w:pPr>
@@ -2026,7 +1959,7 @@
               <w:rPr>
                 <w:sz w:val="20"/>
               </w:rPr>
-              <w:t>Filtering, search, direct messages, statistics, REPL</w:t>
+              <w:t>Date range, keyword search, shares, delete, interactive mode</w:t>
             </w:r>
           </w:p>
         </w:tc>
@@ -2053,7 +1986,7 @@
         </w:trPr>
         <w:tc>
           <w:tcPr>
-            <w:tcW w:w="1296" w:type="dxa"/>
+            <w:tcW w:w="1152" w:type="dxa"/>
           </w:tcPr>
           <w:p>
             <w:pPr>
@@ -2069,7 +2002,7 @@
         </w:tc>
         <w:tc>
           <w:tcPr>
-            <w:tcW w:w="5472" w:type="dxa"/>
+            <w:tcW w:w="5616" w:type="dxa"/>
           </w:tcPr>
           <w:p>
             <w:pPr>
@@ -2079,7 +2012,7 @@
               <w:rPr>
                 <w:sz w:val="20"/>
               </w:rPr>
-              <w:t>Unit tests, go vet and race detector passing</w:t>
+              <w:t>Unit tests in both; AddressSanitizer run on the C++ build</w:t>
             </w:r>
           </w:p>
         </w:tc>
@@ -2106,7 +2039,7 @@
         </w:trPr>
         <w:tc>
           <w:tcPr>
-            <w:tcW w:w="1296" w:type="dxa"/>
+            <w:tcW w:w="1152" w:type="dxa"/>
           </w:tcPr>
           <w:p>
             <w:pPr>
@@ -2122,7 +2055,7 @@
         </w:tc>
         <w:tc>
           <w:tcPr>
-            <w:tcW w:w="5472" w:type="dxa"/>
+            <w:tcW w:w="5616" w:type="dxa"/>
           </w:tcPr>
           <w:p>
             <w:pPr>
@@ -2159,7 +2092,7 @@
         </w:trPr>
         <w:tc>
           <w:tcPr>
-            <w:tcW w:w="1296" w:type="dxa"/>
+            <w:tcW w:w="1152" w:type="dxa"/>
             <w:tcBorders>
               <w:bottom w:val="single" w:sz="8" w:space="0" w:color="000000"/>
             </w:tcBorders>
@@ -2178,7 +2111,7 @@
         </w:tc>
         <w:tc>
           <w:tcPr>
-            <w:tcW w:w="5472" w:type="dxa"/>
+            <w:tcW w:w="5616" w:type="dxa"/>
             <w:tcBorders>
               <w:bottom w:val="single" w:sz="8" w:space="0" w:color="000000"/>
             </w:tcBorders>
@@ -2237,7 +2170,7 @@
         <w:ind w:firstLine="720"/>
       </w:pPr>
       <w:r>
-        <w:t>The planning materials for this deliverable, including the full shared specification and the acceptance checklist, are in the public repository at https://github.com/iknalos/MSCS-632-M30-Group-D1. Implementation is tracked in separate repositories for Day 2 and Day 3, which are listed in that repository’s README.</w:t>
+        <w:t>The planning materials for this deliverable, including the full shared specification with the seeded dataset, the expected totals and the acceptance checklist, are in the public repository at https://github.com/iknalos/MSCS-632-M30-Group-D1. Implementation is tracked in separate repositories for Day 2 and Day 3, which are listed in that repository’s README.</w:t>
       </w:r>
     </w:p>
     <w:p>
@@ -2265,16 +2198,16 @@
         <w:ind w:left="720" w:hanging="720"/>
       </w:pPr>
       <w:r>
-        <w:t xml:space="preserve">Donovan, A. A. A., &amp; Kernighan, B. W. (2015). </w:t>
+        <w:t xml:space="preserve">Meyers, S. (2014). </w:t>
       </w:r>
       <w:r>
         <w:rPr>
           <w:i/>
         </w:rPr>
-        <w:t>The Go programming language</w:t>
+        <w:t>Effective modern C++: 42 specific ways to improve your use of C++11 and C++14</w:t>
       </w:r>
       <w:r>
-        <w:t>. Addison-Wesley.</w:t>
+        <w:t>. O'Reilly Media.</w:t>
       </w:r>
     </w:p>
     <w:p>
@@ -2282,50 +2215,16 @@
         <w:ind w:left="720" w:hanging="720"/>
       </w:pPr>
       <w:r>
-        <w:t xml:space="preserve">Hoare, C. A. R. (1978). Communicating sequential processes. </w:t>
+        <w:t xml:space="preserve">Python Software Foundation. (2026). </w:t>
       </w:r>
       <w:r>
         <w:rPr>
           <w:i/>
         </w:rPr>
-        <w:t>Communications of the ACM, 21</w:t>
+        <w:t>The Python language reference</w:t>
       </w:r>
       <w:r>
-        <w:t>(8), 666-677. https://doi.org/10.1145/359576.359585</w:t>
-      </w:r>
-    </w:p>
-    <w:p>
-      <w:pPr>
-        <w:ind w:left="720" w:hanging="720"/>
-      </w:pPr>
-      <w:r>
-        <w:t xml:space="preserve">Jung, R., Jourdan, J.-H., Krebbers, R., &amp; Dreyer, D. (2021). Safe systems programming in Rust. </w:t>
-      </w:r>
-      <w:r>
-        <w:rPr>
-          <w:i/>
-        </w:rPr>
-        <w:t>Communications of the ACM, 64</w:t>
-      </w:r>
-      <w:r>
-        <w:t>(4), 144-152. https://doi.org/10.1145/3418295</w:t>
-      </w:r>
-    </w:p>
-    <w:p>
-      <w:pPr>
-        <w:ind w:left="720" w:hanging="720"/>
-      </w:pPr>
-      <w:r>
-        <w:t xml:space="preserve">Klabnik, S., &amp; Nichols, C. (2023). </w:t>
-      </w:r>
-      <w:r>
-        <w:rPr>
-          <w:i/>
-        </w:rPr>
-        <w:t>The Rust programming language</w:t>
-      </w:r>
-      <w:r>
-        <w:t xml:space="preserve"> (2nd ed.). No Starch Press.</w:t>
+        <w:t xml:space="preserve"> (Version 3.14). Retrieved October 2, 2026, from https://docs.python.org/3/reference/</w:t>
       </w:r>
     </w:p>
     <w:p>
@@ -2343,6 +2242,23 @@
       </w:r>
       <w:r>
         <w:t xml:space="preserve"> (12th ed.). Pearson.</w:t>
+      </w:r>
+    </w:p>
+    <w:p>
+      <w:pPr>
+        <w:ind w:left="720" w:hanging="720"/>
+      </w:pPr>
+      <w:r>
+        <w:t xml:space="preserve">Stroustrup, B. (2013). </w:t>
+      </w:r>
+      <w:r>
+        <w:rPr>
+          <w:i/>
+        </w:rPr>
+        <w:t>The C++ programming language</w:t>
+      </w:r>
+      <w:r>
+        <w:t xml:space="preserve"> (4th ed.). Addison-Wesley.</w:t>
       </w:r>
     </w:p>
     <w:sectPr>
@@ -2609,31 +2525,31 @@
       </w:rPr>
     </w:lvl>
   </w:abstractNum>
-  <w:num w:numId="1" w16cid:durableId="1448623035">
+  <w:num w:numId="1" w16cid:durableId="1037852263">
     <w:abstractNumId w:val="8"/>
   </w:num>
-  <w:num w:numId="2" w16cid:durableId="774984252">
+  <w:num w:numId="2" w16cid:durableId="1562326494">
     <w:abstractNumId w:val="6"/>
   </w:num>
-  <w:num w:numId="3" w16cid:durableId="223951370">
+  <w:num w:numId="3" w16cid:durableId="1920603091">
     <w:abstractNumId w:val="5"/>
   </w:num>
-  <w:num w:numId="4" w16cid:durableId="1468008810">
+  <w:num w:numId="4" w16cid:durableId="1562208066">
     <w:abstractNumId w:val="4"/>
   </w:num>
-  <w:num w:numId="5" w16cid:durableId="1184199566">
+  <w:num w:numId="5" w16cid:durableId="1189563293">
     <w:abstractNumId w:val="7"/>
   </w:num>
-  <w:num w:numId="6" w16cid:durableId="9845535">
+  <w:num w:numId="6" w16cid:durableId="346713324">
     <w:abstractNumId w:val="3"/>
   </w:num>
-  <w:num w:numId="7" w16cid:durableId="125853255">
+  <w:num w:numId="7" w16cid:durableId="1838379612">
     <w:abstractNumId w:val="2"/>
   </w:num>
-  <w:num w:numId="8" w16cid:durableId="220167977">
+  <w:num w:numId="8" w16cid:durableId="1830705600">
     <w:abstractNumId w:val="1"/>
   </w:num>
-  <w:num w:numId="9" w16cid:durableId="568926078">
+  <w:num w:numId="9" w16cid:durableId="1280186609">
     <w:abstractNumId w:val="0"/>
   </w:num>
 </w:numbering>

</xml_diff>